<commit_message>
Atualizando análise e fichamento dos artigos lidos
</commit_message>
<xml_diff>
--- a/TCC/Análise dos artigos lidos/Análise de artigos.docx
+++ b/TCC/Análise dos artigos lidos/Análise de artigos.docx
@@ -125,16 +125,14 @@
         <w:rPr>
           <w:b w:val="1"/>
           <w:bCs w:val="1"/>
-          <w:color w:val="000000"/>
-          <w:sz w:val="26"/>
-          <w:szCs w:val="26"/>
-        </w:rPr>
-      </w:pPr>
-      <w:r>
-        <w:rPr>
-          <w:b w:val="1"/>
-          <w:bCs w:val="1"/>
-          <w:color w:val="000000"/>
+          <w:sz w:val="26"/>
+          <w:szCs w:val="26"/>
+        </w:rPr>
+      </w:pPr>
+      <w:r>
+        <w:rPr>
+          <w:b w:val="1"/>
+          <w:bCs w:val="1"/>
           <w:sz w:val="26"/>
           <w:szCs w:val="26"/>
           <w:rtl w:val="0"/>
@@ -241,6 +239,7 @@
         </w:numPr>
         <w:spacing w:after="240" w:before="240" w:lineRule="auto"/>
         <w:ind w:left="720" w:hanging="360"/>
+        <w:rPr/>
       </w:pPr>
       <w:r>
         <w:rPr>
@@ -421,6 +420,7 @@
         </w:numPr>
         <w:spacing w:after="0" w:afterAutospacing="0" w:before="240" w:lineRule="auto"/>
         <w:ind w:left="720" w:hanging="360"/>
+        <w:rPr/>
       </w:pPr>
       <w:r>
         <w:rPr>
@@ -445,6 +445,7 @@
         </w:numPr>
         <w:spacing w:after="0" w:afterAutospacing="0" w:before="0" w:beforeAutospacing="0" w:lineRule="auto"/>
         <w:ind w:left="1440" w:hanging="360"/>
+        <w:rPr/>
       </w:pPr>
       <w:r>
         <w:rPr>
@@ -469,6 +470,7 @@
         </w:numPr>
         <w:spacing w:after="240" w:before="0" w:beforeAutospacing="0" w:lineRule="auto"/>
         <w:ind w:left="1440" w:hanging="360"/>
+        <w:rPr/>
       </w:pPr>
       <w:r>
         <w:rPr>
@@ -558,6 +560,7 @@
         </w:numPr>
         <w:spacing w:after="0" w:afterAutospacing="0" w:before="240" w:lineRule="auto"/>
         <w:ind w:left="720" w:hanging="360"/>
+        <w:rPr/>
       </w:pPr>
       <w:r>
         <w:rPr>
@@ -582,6 +585,7 @@
         </w:numPr>
         <w:spacing w:after="0" w:afterAutospacing="0" w:before="0" w:beforeAutospacing="0" w:lineRule="auto"/>
         <w:ind w:left="720" w:hanging="360"/>
+        <w:rPr/>
       </w:pPr>
       <w:r>
         <w:rPr>
@@ -606,6 +610,7 @@
         </w:numPr>
         <w:spacing w:after="0" w:afterAutospacing="0" w:before="0" w:beforeAutospacing="0" w:lineRule="auto"/>
         <w:ind w:left="720" w:hanging="360"/>
+        <w:rPr/>
       </w:pPr>
       <w:r>
         <w:rPr>
@@ -636,6 +641,7 @@
         </w:numPr>
         <w:spacing w:after="240" w:before="0" w:beforeAutospacing="0" w:lineRule="auto"/>
         <w:ind w:left="720" w:hanging="360"/>
+        <w:rPr/>
       </w:pPr>
       <w:r>
         <w:rPr>
@@ -754,7 +760,6 @@
     <w:p>
       <w:pPr>
         <w:rPr>
-          <w:color w:val="000000"/>
           <w:sz w:val="22"/>
           <w:szCs w:val="22"/>
         </w:rPr>
@@ -834,6 +839,7 @@
         </w:numPr>
         <w:spacing w:after="0" w:afterAutospacing="0" w:before="240" w:lineRule="auto"/>
         <w:ind w:left="720" w:hanging="360"/>
+        <w:rPr/>
       </w:pPr>
       <w:r>
         <w:rPr>
@@ -884,6 +890,7 @@
         </w:numPr>
         <w:spacing w:after="0" w:afterAutospacing="0" w:before="0" w:beforeAutospacing="0" w:lineRule="auto"/>
         <w:ind w:left="720" w:hanging="360"/>
+        <w:rPr/>
       </w:pPr>
       <w:r>
         <w:rPr>
@@ -936,6 +943,7 @@
         </w:numPr>
         <w:spacing w:after="240" w:before="0" w:beforeAutospacing="0" w:lineRule="auto"/>
         <w:ind w:left="720" w:hanging="360"/>
+        <w:rPr/>
       </w:pPr>
       <w:r>
         <w:rPr>
@@ -1201,7 +1209,6 @@
         <w:rPr>
           <w:b w:val="1"/>
           <w:bCs w:val="1"/>
-          <w:color w:val="000000"/>
           <w:sz w:val="26"/>
           <w:szCs w:val="26"/>
         </w:rPr>
@@ -1227,11 +1234,6 @@
           <w:rtl w:val="0"/>
         </w:rPr>
         <w:t xml:space="preserve"> (Nesbit &amp; Li, 2004) </w:t>
-      </w:r>
-      <w:r>
-        <w:rPr>
-          <w:rtl w:val="0"/>
-        </w:rPr>
       </w:r>
     </w:p>
     <w:p>
@@ -1331,7 +1333,6 @@
         <w:rPr>
           <w:b w:val="1"/>
           <w:bCs w:val="1"/>
-          <w:color w:val="000000"/>
           <w:sz w:val="26"/>
           <w:szCs w:val="26"/>
         </w:rPr>
@@ -1415,7 +1416,6 @@
         <w:rPr>
           <w:b w:val="1"/>
           <w:bCs w:val="1"/>
-          <w:color w:val="000000"/>
           <w:sz w:val="26"/>
           <w:szCs w:val="26"/>
         </w:rPr>
@@ -1508,6 +1508,7 @@
         </w:numPr>
         <w:spacing w:after="0" w:afterAutospacing="0" w:before="240" w:lineRule="auto"/>
         <w:ind w:left="720" w:hanging="360"/>
+        <w:rPr/>
       </w:pPr>
       <w:r>
         <w:rPr>
@@ -1532,6 +1533,7 @@
         </w:numPr>
         <w:spacing w:after="0" w:afterAutospacing="0" w:before="0" w:beforeAutospacing="0" w:lineRule="auto"/>
         <w:ind w:left="720" w:hanging="360"/>
+        <w:rPr/>
       </w:pPr>
       <w:r>
         <w:rPr>
@@ -1556,6 +1558,7 @@
         </w:numPr>
         <w:spacing w:after="240" w:before="0" w:beforeAutospacing="0" w:lineRule="auto"/>
         <w:ind w:left="720" w:hanging="360"/>
+        <w:rPr/>
       </w:pPr>
       <w:r>
         <w:rPr>
@@ -1670,7 +1673,9 @@
         <w:keepLines w:val="0"/>
         <w:spacing w:before="280" w:lineRule="auto"/>
         <w:ind w:left="0" w:firstLine="0"/>
-        <w:rPr/>
+        <w:rPr>
+          <w:color w:val="000000"/>
+        </w:rPr>
       </w:pPr>
       <w:bookmarkStart w:colFirst="0" w:colLast="0" w:name="_8f16gp1q2ldt" w:id="14"/>
       <w:bookmarkEnd w:id="14"/>
@@ -2720,7 +2725,6 @@
         <w:rPr>
           <w:b w:val="1"/>
           <w:bCs w:val="1"/>
-          <w:color w:val="000000"/>
           <w:sz w:val="26"/>
           <w:szCs w:val="26"/>
         </w:rPr>
@@ -2818,7 +2822,6 @@
         <w:rPr>
           <w:b w:val="1"/>
           <w:bCs w:val="1"/>
-          <w:color w:val="000000"/>
           <w:sz w:val="26"/>
           <w:szCs w:val="26"/>
         </w:rPr>
@@ -2902,7 +2905,6 @@
         <w:rPr>
           <w:b w:val="1"/>
           <w:bCs w:val="1"/>
-          <w:color w:val="000000"/>
           <w:sz w:val="26"/>
           <w:szCs w:val="26"/>
         </w:rPr>
@@ -6018,23 +6020,11 @@
         <w:rPr>
           <w:b w:val="1"/>
           <w:bCs w:val="1"/>
-          <w:i w:val="1"/>
-          <w:iCs w:val="1"/>
-          <w:sz w:val="26"/>
-          <w:szCs w:val="26"/>
-          <w:rtl w:val="0"/>
-        </w:rPr>
-        <w:t xml:space="preserve">Example-Based Learning in Software Engineering Education: a Systematic Mapping Study</w:t>
-      </w:r>
-      <w:r>
-        <w:rPr>
-          <w:b w:val="1"/>
-          <w:bCs w:val="1"/>
-          <w:sz w:val="26"/>
-          <w:szCs w:val="26"/>
-          <w:rtl w:val="0"/>
-        </w:rPr>
-        <w:t xml:space="preserve"> (Bonetti, Silva &amp; Colanzi, 2025)</w:t>
+          <w:sz w:val="26"/>
+          <w:szCs w:val="26"/>
+          <w:rtl w:val="0"/>
+        </w:rPr>
+        <w:t xml:space="preserve">Example-Based Learning in Software Engineering Education: a Systematic Mapping Study (Bonetti, Silva &amp; Colanzi, 2025)</w:t>
       </w:r>
     </w:p>
     <w:p>
@@ -7042,6 +7032,7 @@
         </w:numPr>
         <w:spacing w:after="0" w:afterAutospacing="0" w:before="240" w:lineRule="auto"/>
         <w:ind w:left="720" w:hanging="360"/>
+        <w:rPr/>
       </w:pPr>
       <w:r>
         <w:rPr>
@@ -7066,6 +7057,7 @@
         </w:numPr>
         <w:spacing w:after="0" w:afterAutospacing="0" w:before="0" w:beforeAutospacing="0" w:lineRule="auto"/>
         <w:ind w:left="720" w:hanging="360"/>
+        <w:rPr/>
       </w:pPr>
       <w:r>
         <w:rPr>
@@ -7090,6 +7082,7 @@
         </w:numPr>
         <w:spacing w:after="0" w:afterAutospacing="0" w:before="0" w:beforeAutospacing="0" w:lineRule="auto"/>
         <w:ind w:left="720" w:hanging="360"/>
+        <w:rPr/>
       </w:pPr>
       <w:r>
         <w:rPr>
@@ -7114,6 +7107,7 @@
         </w:numPr>
         <w:spacing w:after="0" w:afterAutospacing="0" w:before="0" w:beforeAutospacing="0" w:lineRule="auto"/>
         <w:ind w:left="720" w:hanging="360"/>
+        <w:rPr/>
       </w:pPr>
       <w:r>
         <w:rPr>
@@ -7138,6 +7132,7 @@
         </w:numPr>
         <w:spacing w:after="0" w:afterAutospacing="0" w:before="0" w:beforeAutospacing="0" w:lineRule="auto"/>
         <w:ind w:left="720" w:hanging="360"/>
+        <w:rPr/>
       </w:pPr>
       <w:r>
         <w:rPr>
@@ -7162,6 +7157,7 @@
         </w:numPr>
         <w:spacing w:after="0" w:afterAutospacing="0" w:before="0" w:beforeAutospacing="0" w:lineRule="auto"/>
         <w:ind w:left="720" w:hanging="360"/>
+        <w:rPr/>
       </w:pPr>
       <w:r>
         <w:rPr>
@@ -7186,6 +7182,7 @@
         </w:numPr>
         <w:spacing w:after="0" w:afterAutospacing="0" w:before="0" w:beforeAutospacing="0" w:lineRule="auto"/>
         <w:ind w:left="720" w:hanging="360"/>
+        <w:rPr/>
       </w:pPr>
       <w:r>
         <w:rPr>
@@ -7210,6 +7207,7 @@
         </w:numPr>
         <w:spacing w:after="240" w:before="0" w:beforeAutospacing="0" w:lineRule="auto"/>
         <w:ind w:left="720" w:hanging="360"/>
+        <w:rPr/>
       </w:pPr>
       <w:r>
         <w:rPr>
@@ -8827,6 +8825,1332 @@
       <w:pPr>
         <w:rPr/>
       </w:pPr>
+      <w:r>
+        <w:rPr>
+          <w:rtl w:val="0"/>
+        </w:rPr>
+      </w:r>
+    </w:p>
+    <w:p>
+      <w:pPr>
+        <w:rPr/>
+      </w:pPr>
+      <w:r>
+        <w:rPr>
+          <w:rtl w:val="0"/>
+        </w:rPr>
+      </w:r>
+    </w:p>
+    <w:p>
+      <w:pPr>
+        <w:rPr/>
+      </w:pPr>
+      <w:r>
+        <w:rPr>
+          <w:rtl w:val="0"/>
+        </w:rPr>
+      </w:r>
+    </w:p>
+    <w:p>
+      <w:pPr>
+        <w:rPr/>
+      </w:pPr>
+      <w:r>
+        <w:rPr>
+          <w:rtl w:val="0"/>
+        </w:rPr>
+      </w:r>
+    </w:p>
+    <w:p>
+      <w:pPr>
+        <w:rPr/>
+      </w:pPr>
+      <w:r>
+        <w:rPr>
+          <w:rtl w:val="0"/>
+        </w:rPr>
+      </w:r>
+    </w:p>
+    <w:p>
+      <w:pPr>
+        <w:rPr/>
+      </w:pPr>
+      <w:r>
+        <w:rPr>
+          <w:rtl w:val="0"/>
+        </w:rPr>
+      </w:r>
+    </w:p>
+    <w:p>
+      <w:pPr>
+        <w:rPr/>
+      </w:pPr>
+      <w:r>
+        <w:rPr>
+          <w:rtl w:val="0"/>
+        </w:rPr>
+      </w:r>
+    </w:p>
+    <w:p>
+      <w:pPr>
+        <w:rPr/>
+      </w:pPr>
+      <w:r>
+        <w:rPr>
+          <w:rtl w:val="0"/>
+        </w:rPr>
+      </w:r>
+    </w:p>
+    <w:p>
+      <w:pPr>
+        <w:rPr/>
+      </w:pPr>
+      <w:r>
+        <w:rPr>
+          <w:rtl w:val="0"/>
+        </w:rPr>
+      </w:r>
+    </w:p>
+    <w:p>
+      <w:pPr>
+        <w:rPr/>
+      </w:pPr>
+      <w:r>
+        <w:rPr>
+          <w:rtl w:val="0"/>
+        </w:rPr>
+      </w:r>
+    </w:p>
+    <w:p>
+      <w:pPr>
+        <w:rPr/>
+      </w:pPr>
+      <w:r>
+        <w:rPr>
+          <w:rtl w:val="0"/>
+        </w:rPr>
+      </w:r>
+    </w:p>
+    <w:p>
+      <w:pPr>
+        <w:pStyle w:val="Heading1"/>
+        <w:keepNext w:val="0"/>
+        <w:keepLines w:val="0"/>
+        <w:spacing w:before="360" w:lineRule="auto"/>
+        <w:rPr>
+          <w:b w:val="1"/>
+          <w:bCs w:val="1"/>
+          <w:sz w:val="26"/>
+          <w:szCs w:val="26"/>
+        </w:rPr>
+      </w:pPr>
+      <w:bookmarkStart w:colFirst="0" w:colLast="0" w:name="_77lj1t4y7oie" w:id="50"/>
+      <w:bookmarkEnd w:id="50"/>
+      <w:r>
+        <w:rPr>
+          <w:b w:val="1"/>
+          <w:bCs w:val="1"/>
+          <w:sz w:val="26"/>
+          <w:szCs w:val="26"/>
+          <w:rtl w:val="0"/>
+        </w:rPr>
+        <w:t xml:space="preserve">Failure Rates in Introductory Programming (J. Bennedsen e M. E. Caspersen, 2007)</w:t>
+      </w:r>
+    </w:p>
+    <w:p>
+      <w:pPr>
+        <w:spacing w:after="240" w:before="240" w:lineRule="auto"/>
+        <w:rPr/>
+      </w:pPr>
+      <w:r>
+        <w:rPr>
+          <w:rtl w:val="0"/>
+        </w:rPr>
+      </w:r>
+    </w:p>
+    <w:p>
+      <w:pPr>
+        <w:rPr/>
+      </w:pPr>
+      <w:r>
+        <w:pict>
+          <v:rect style="width:0.0pt;height:1.5pt" o:hr="t" o:hrstd="t" o:hralign="center" fillcolor="#A0A0A0" stroked="f"/>
+        </w:pict>
+      </w:r>
+      <w:r>
+        <w:rPr>
+          <w:rtl w:val="0"/>
+        </w:rPr>
+      </w:r>
+    </w:p>
+    <w:p>
+      <w:pPr>
+        <w:pStyle w:val="Heading2"/>
+        <w:keepNext w:val="0"/>
+        <w:keepLines w:val="0"/>
+        <w:spacing w:after="80" w:before="240" w:lineRule="auto"/>
+        <w:rPr>
+          <w:b w:val="1"/>
+          <w:bCs w:val="1"/>
+          <w:sz w:val="26"/>
+          <w:szCs w:val="26"/>
+        </w:rPr>
+      </w:pPr>
+      <w:bookmarkStart w:colFirst="0" w:colLast="0" w:name="_72ztwxs0h2jw" w:id="51"/>
+      <w:bookmarkEnd w:id="51"/>
+      <w:r>
+        <w:rPr>
+          <w:b w:val="1"/>
+          <w:bCs w:val="1"/>
+          <w:sz w:val="26"/>
+          <w:szCs w:val="26"/>
+          <w:rtl w:val="0"/>
+        </w:rPr>
+        <w:t xml:space="preserve">Contexto</w:t>
+      </w:r>
+    </w:p>
+    <w:p>
+      <w:pPr>
+        <w:spacing w:after="120" w:lineRule="auto"/>
+        <w:jc w:val="both"/>
+        <w:rPr/>
+      </w:pPr>
+      <w:r>
+        <w:rPr>
+          <w:rtl w:val="0"/>
+        </w:rPr>
+        <w:t xml:space="preserve">É concepção corrente na comunidade de educação em computação que CS1 (a disciplina introdutória de programação) é muito difícil e que suas taxas de reprovação são altas. Até a publicação deste artigo, entretanto, essa crença se apoiava apenas em evidência anedótica, mais próxima de sabedoria popular repetida do que de estatística oficial ou investigação sistemática. As únicas fontes disponíveis eram autores relatando as taxas de seus próprios cursos em artigos sobre outros temas. Organizações internacionais como a UNESCO coletam dados educacionais mundiais, porém sem granularidade suficiente para chegar ao nível de disciplinas individuais.</w:t>
+      </w:r>
+    </w:p>
+    <w:p>
+      <w:pPr>
+        <w:rPr/>
+      </w:pPr>
+      <w:r>
+        <w:pict>
+          <v:rect style="width:0.0pt;height:1.5pt" o:hr="t" o:hrstd="t" o:hralign="center" fillcolor="#A0A0A0" stroked="f"/>
+        </w:pict>
+      </w:r>
+      <w:r>
+        <w:rPr>
+          <w:rtl w:val="0"/>
+        </w:rPr>
+      </w:r>
+    </w:p>
+    <w:p>
+      <w:pPr>
+        <w:pStyle w:val="Heading2"/>
+        <w:keepNext w:val="0"/>
+        <w:keepLines w:val="0"/>
+        <w:spacing w:after="80" w:before="240" w:lineRule="auto"/>
+        <w:rPr>
+          <w:b w:val="1"/>
+          <w:bCs w:val="1"/>
+          <w:sz w:val="26"/>
+          <w:szCs w:val="26"/>
+        </w:rPr>
+      </w:pPr>
+      <w:bookmarkStart w:colFirst="0" w:colLast="0" w:name="_ww6lswlq8g0z" w:id="52"/>
+      <w:bookmarkEnd w:id="52"/>
+      <w:r>
+        <w:rPr>
+          <w:b w:val="1"/>
+          <w:bCs w:val="1"/>
+          <w:sz w:val="26"/>
+          <w:szCs w:val="26"/>
+          <w:rtl w:val="0"/>
+        </w:rPr>
+        <w:t xml:space="preserve">Problema</w:t>
+      </w:r>
+    </w:p>
+    <w:p>
+      <w:pPr>
+        <w:spacing w:after="120" w:lineRule="auto"/>
+        <w:jc w:val="both"/>
+        <w:rPr/>
+      </w:pPr>
+      <w:r>
+        <w:rPr>
+          <w:rtl w:val="0"/>
+        </w:rPr>
+        <w:t xml:space="preserve">Não existiam estatísticas mundiais sobre taxas de reprovação, evasão ou aprovação em cursos introdutórios de programação no nível universitário. Visões equivocadas sobre essas taxas têm implicações sérias: um professor com alta reprovação pode aceitá-la como norma da área e não agir para melhorar o curso, e a reputação de dificuldade pode afastar potenciais alunos num cenário de queda nas matrículas em computação. As questões de pesquisa foram: quais são as taxas de reprovação e aprovação de cursos introdutórios de programação no nível universitário? E: a taxa de reprovação é alta?</w:t>
+      </w:r>
+    </w:p>
+    <w:p>
+      <w:pPr>
+        <w:rPr/>
+      </w:pPr>
+      <w:r>
+        <w:pict>
+          <v:rect style="width:0.0pt;height:1.5pt" o:hr="t" o:hrstd="t" o:hralign="center" fillcolor="#A0A0A0" stroked="f"/>
+        </w:pict>
+      </w:r>
+      <w:r>
+        <w:rPr>
+          <w:rtl w:val="0"/>
+        </w:rPr>
+      </w:r>
+    </w:p>
+    <w:p>
+      <w:pPr>
+        <w:pStyle w:val="Heading2"/>
+        <w:keepNext w:val="0"/>
+        <w:keepLines w:val="0"/>
+        <w:spacing w:after="80" w:before="240" w:lineRule="auto"/>
+        <w:rPr>
+          <w:b w:val="1"/>
+          <w:bCs w:val="1"/>
+          <w:sz w:val="26"/>
+          <w:szCs w:val="26"/>
+        </w:rPr>
+      </w:pPr>
+      <w:bookmarkStart w:colFirst="0" w:colLast="0" w:name="_3ea05qaa5nk6" w:id="53"/>
+      <w:bookmarkEnd w:id="53"/>
+      <w:r>
+        <w:rPr>
+          <w:b w:val="1"/>
+          <w:bCs w:val="1"/>
+          <w:sz w:val="26"/>
+          <w:szCs w:val="26"/>
+          <w:rtl w:val="0"/>
+        </w:rPr>
+        <w:t xml:space="preserve">Solução / Método</w:t>
+      </w:r>
+    </w:p>
+    <w:p>
+      <w:pPr>
+        <w:spacing w:after="120" w:lineRule="auto"/>
+        <w:jc w:val="both"/>
+        <w:rPr/>
+      </w:pPr>
+      <w:r>
+        <w:rPr>
+          <w:rtl w:val="0"/>
+        </w:rPr>
+        <w:t xml:space="preserve">Questionário curto baseado na web, definindo quatro termos que os respondentes deveriam quantificar: abort (alunos que abandonam antes do exame final), skip (alunos que não comparecem ao exame final embora pudessem), fail (reprovados) e pass (aprovados). Também foram coletados o paradigma do curso (imperativo, orientado a objetos ou funcional), o tipo de instituição e a forma de avaliação. O convite foi enviado a 575 autores e panelistas de cinco conferências de educação em computação (Koli Calling 2004, SIGCSE 2005, ITiCSE 2005, ICALT 2004 e ACEC 2004); descontadas as mensagens não entregues, a população foi de 497 pessoas. Houve 80 respostas, das quais 63 utilizáveis (12,7%).</w:t>
+      </w:r>
+    </w:p>
+    <w:p>
+      <w:pPr>
+        <w:rPr/>
+      </w:pPr>
+      <w:r>
+        <w:pict>
+          <v:rect style="width:0.0pt;height:1.5pt" o:hr="t" o:hrstd="t" o:hralign="center" fillcolor="#A0A0A0" stroked="f"/>
+        </w:pict>
+      </w:r>
+      <w:r>
+        <w:rPr>
+          <w:rtl w:val="0"/>
+        </w:rPr>
+      </w:r>
+    </w:p>
+    <w:p>
+      <w:pPr>
+        <w:pStyle w:val="Heading2"/>
+        <w:keepNext w:val="0"/>
+        <w:keepLines w:val="0"/>
+        <w:spacing w:after="80" w:before="240" w:lineRule="auto"/>
+        <w:rPr>
+          <w:b w:val="1"/>
+          <w:bCs w:val="1"/>
+          <w:sz w:val="26"/>
+          <w:szCs w:val="26"/>
+        </w:rPr>
+      </w:pPr>
+      <w:bookmarkStart w:colFirst="0" w:colLast="0" w:name="_excgl94b8aiw" w:id="54"/>
+      <w:bookmarkEnd w:id="54"/>
+      <w:r>
+        <w:rPr>
+          <w:b w:val="1"/>
+          <w:bCs w:val="1"/>
+          <w:sz w:val="26"/>
+          <w:szCs w:val="26"/>
+          <w:rtl w:val="0"/>
+        </w:rPr>
+        <w:t xml:space="preserve">Avaliação</w:t>
+      </w:r>
+    </w:p>
+    <w:p>
+      <w:pPr>
+        <w:spacing w:after="120" w:lineRule="auto"/>
+        <w:jc w:val="both"/>
+        <w:rPr/>
+      </w:pPr>
+      <w:r>
+        <w:rPr>
+          <w:rtl w:val="0"/>
+        </w:rPr>
+        <w:t xml:space="preserve">Os próprios autores tratam as limitações com franqueza. A amostra é pequena e enviesada: 66% das respostas vieram dos Estados Unidos, distribuição que os autores contrastam com os números da UNESCO para concluir que a representatividade é menor do que desejariam. Há também viés de autosseleção em duas camadas: professores que publicam sobre educação em computação tendem a ser mais engajados na melhoria do ensino, e instituições com taxas embaraçosas podem ter evitado responder (o artigo menciona relatos extremos, como uma instituição com 90% de reprovação média em dez anos, ausentes da amostra). O estudo se apresenta explicitamente como indicador de um limite inferior do estado real, não como censo, e conclui recomendando que organizações como o ACM Education Council conduzam coleta sistemática.</w:t>
+      </w:r>
+    </w:p>
+    <w:p>
+      <w:pPr>
+        <w:rPr/>
+      </w:pPr>
+      <w:r>
+        <w:pict>
+          <v:rect style="width:0.0pt;height:1.5pt" o:hr="t" o:hrstd="t" o:hralign="center" fillcolor="#A0A0A0" stroked="f"/>
+        </w:pict>
+      </w:r>
+      <w:r>
+        <w:rPr>
+          <w:rtl w:val="0"/>
+        </w:rPr>
+      </w:r>
+    </w:p>
+    <w:p>
+      <w:pPr>
+        <w:pStyle w:val="Heading2"/>
+        <w:keepNext w:val="0"/>
+        <w:keepLines w:val="0"/>
+        <w:spacing w:after="80" w:before="240" w:lineRule="auto"/>
+        <w:rPr>
+          <w:b w:val="1"/>
+          <w:bCs w:val="1"/>
+          <w:sz w:val="26"/>
+          <w:szCs w:val="26"/>
+        </w:rPr>
+      </w:pPr>
+      <w:bookmarkStart w:colFirst="0" w:colLast="0" w:name="_75ky6v6534xy" w:id="55"/>
+      <w:bookmarkEnd w:id="55"/>
+      <w:r>
+        <w:rPr>
+          <w:b w:val="1"/>
+          <w:bCs w:val="1"/>
+          <w:sz w:val="26"/>
+          <w:szCs w:val="26"/>
+          <w:rtl w:val="0"/>
+        </w:rPr>
+        <w:t xml:space="preserve">Resultados</w:t>
+      </w:r>
+    </w:p>
+    <w:p>
+      <w:pPr>
+        <w:spacing w:after="120" w:lineRule="auto"/>
+        <w:jc w:val="both"/>
+        <w:rPr/>
+      </w:pPr>
+      <w:r>
+        <w:rPr>
+          <w:rtl w:val="0"/>
+        </w:rPr>
+        <w:t xml:space="preserve">A taxa agregada de aprovação foi de 67% (cursos maiores pesam mais), ou 72% dando peso igual a cada curso, o que corresponde a uma reprovação ampla (abort + skip + fail) em torno de 33%. As médias por categoria foram: abort 12,5%, skip 3,5%, fail 11,6%. A variação entre cursos é enorme, de 5% a 100% de aprovação. Turmas pequenas (menos de 30 alunos) aprovaram mais que as grandes (82% contra 69%). Faculdades aprovaram mais que universidades (88% contra 66%), sem significância estatística pelo baixo número de faculdades. A taxa de aprovação mostrou-se praticamente idêntica entre paradigmas de curso e não se encontrou correlação com a forma de avaliação. A conclusão central é deliberadamente contida: os dados não sustentam a afirmação frequente de que CS1 é dificílima e reprova em massa, mas o baixo número de respostas impede conclusões firmes.</w:t>
+      </w:r>
+    </w:p>
+    <w:p>
+      <w:pPr>
+        <w:rPr/>
+      </w:pPr>
+      <w:r>
+        <w:pict>
+          <v:rect style="width:0.0pt;height:1.5pt" o:hr="t" o:hrstd="t" o:hralign="center" fillcolor="#A0A0A0" stroked="f"/>
+        </w:pict>
+      </w:r>
+      <w:r>
+        <w:rPr>
+          <w:rtl w:val="0"/>
+        </w:rPr>
+      </w:r>
+    </w:p>
+    <w:p>
+      <w:pPr>
+        <w:pStyle w:val="Heading2"/>
+        <w:keepNext w:val="0"/>
+        <w:keepLines w:val="0"/>
+        <w:spacing w:after="80" w:before="240" w:lineRule="auto"/>
+        <w:rPr>
+          <w:b w:val="1"/>
+          <w:bCs w:val="1"/>
+          <w:sz w:val="26"/>
+          <w:szCs w:val="26"/>
+        </w:rPr>
+      </w:pPr>
+      <w:bookmarkStart w:colFirst="0" w:colLast="0" w:name="_b363wo7q4grx" w:id="56"/>
+      <w:bookmarkEnd w:id="56"/>
+      <w:r>
+        <w:rPr>
+          <w:b w:val="1"/>
+          <w:bCs w:val="1"/>
+          <w:sz w:val="26"/>
+          <w:szCs w:val="26"/>
+          <w:rtl w:val="0"/>
+        </w:rPr>
+        <w:t xml:space="preserve">Como se aplica ao meu trabalho?</w:t>
+      </w:r>
+    </w:p>
+    <w:p>
+      <w:pPr>
+        <w:spacing w:after="120" w:lineRule="auto"/>
+        <w:jc w:val="both"/>
+        <w:rPr/>
+      </w:pPr>
+      <w:r>
+        <w:rPr>
+          <w:rtl w:val="0"/>
+        </w:rPr>
+        <w:t xml:space="preserve">Este é o estudo fundador da linha de evidência quantitativa sobre reprovação em CS1 e a fonte primária da estimativa de um terço que uso na abertura da introdução. Três cuidados de citação saem da leitura. Primeiro, a conclusão dos autores é que a taxa NÃO é alarmantemente alta; portanto, a formulação da minha introdução deve reivindicar taxas expressivas e um problema real de escala, sem adjetivar como alarmante ou dramática. Segundo, o argumento de escala dos próprios autores serve à minha motivação: com cerca de dois milhões de matrículas anuais em computação no mundo, mesmo um ganho de um ponto percentual na aprovação representa cerca de vinte mil alunos a mais aprovados por ano, o que justifica investir em recursos de apoio como objetos de aprendizagem. Terceiro, a observação de que professores podem aceitar a reprovação como norma da área reforça o papel de recursos de consolidação prontos para adoção, que reduzem o custo de agir.</w:t>
+      </w:r>
+    </w:p>
+    <w:p>
+      <w:pPr>
+        <w:rPr/>
+      </w:pPr>
+      <w:r>
+        <w:pict>
+          <v:rect style="width:0.0pt;height:1.5pt" o:hr="t" o:hrstd="t" o:hralign="center" fillcolor="#A0A0A0" stroked="f"/>
+        </w:pict>
+      </w:r>
+      <w:r>
+        <w:rPr>
+          <w:rtl w:val="0"/>
+        </w:rPr>
+      </w:r>
+    </w:p>
+    <w:p>
+      <w:pPr>
+        <w:pStyle w:val="Heading1"/>
+        <w:keepNext w:val="0"/>
+        <w:keepLines w:val="0"/>
+        <w:spacing w:before="360" w:lineRule="auto"/>
+        <w:rPr>
+          <w:b w:val="1"/>
+          <w:bCs w:val="1"/>
+          <w:sz w:val="30"/>
+          <w:szCs w:val="30"/>
+        </w:rPr>
+      </w:pPr>
+      <w:bookmarkStart w:colFirst="0" w:colLast="0" w:name="_s2174l5kl1mu" w:id="57"/>
+      <w:bookmarkEnd w:id="57"/>
+      <w:r>
+        <w:rPr>
+          <w:rtl w:val="0"/>
+        </w:rPr>
+      </w:r>
+    </w:p>
+    <w:p>
+      <w:pPr>
+        <w:pStyle w:val="Heading1"/>
+        <w:keepNext w:val="0"/>
+        <w:keepLines w:val="0"/>
+        <w:spacing w:before="360" w:lineRule="auto"/>
+        <w:rPr>
+          <w:b w:val="1"/>
+          <w:bCs w:val="1"/>
+          <w:sz w:val="30"/>
+          <w:szCs w:val="30"/>
+        </w:rPr>
+      </w:pPr>
+      <w:bookmarkStart w:colFirst="0" w:colLast="0" w:name="_crqe9ligpqyy" w:id="58"/>
+      <w:bookmarkEnd w:id="58"/>
+      <w:r>
+        <w:rPr>
+          <w:rtl w:val="0"/>
+        </w:rPr>
+      </w:r>
+    </w:p>
+    <w:p>
+      <w:pPr>
+        <w:pStyle w:val="Heading1"/>
+        <w:keepNext w:val="0"/>
+        <w:keepLines w:val="0"/>
+        <w:spacing w:before="360" w:lineRule="auto"/>
+        <w:rPr>
+          <w:b w:val="1"/>
+          <w:bCs w:val="1"/>
+          <w:sz w:val="30"/>
+          <w:szCs w:val="30"/>
+        </w:rPr>
+      </w:pPr>
+      <w:bookmarkStart w:colFirst="0" w:colLast="0" w:name="_ndlb4ivi2087" w:id="59"/>
+      <w:bookmarkEnd w:id="59"/>
+      <w:r>
+        <w:rPr>
+          <w:rtl w:val="0"/>
+        </w:rPr>
+      </w:r>
+    </w:p>
+    <w:p>
+      <w:pPr>
+        <w:pStyle w:val="Heading1"/>
+        <w:keepNext w:val="0"/>
+        <w:keepLines w:val="0"/>
+        <w:spacing w:before="360" w:lineRule="auto"/>
+        <w:rPr>
+          <w:b w:val="1"/>
+          <w:bCs w:val="1"/>
+          <w:sz w:val="30"/>
+          <w:szCs w:val="30"/>
+        </w:rPr>
+      </w:pPr>
+      <w:bookmarkStart w:colFirst="0" w:colLast="0" w:name="_9tf82pna6s5" w:id="60"/>
+      <w:bookmarkEnd w:id="60"/>
+      <w:r>
+        <w:rPr>
+          <w:rtl w:val="0"/>
+        </w:rPr>
+      </w:r>
+    </w:p>
+    <w:p>
+      <w:pPr>
+        <w:pStyle w:val="Heading1"/>
+        <w:keepNext w:val="0"/>
+        <w:keepLines w:val="0"/>
+        <w:spacing w:before="360" w:lineRule="auto"/>
+        <w:rPr>
+          <w:sz w:val="22"/>
+          <w:szCs w:val="22"/>
+        </w:rPr>
+      </w:pPr>
+      <w:bookmarkStart w:colFirst="0" w:colLast="0" w:name="_gbzbw1j4v24u" w:id="61"/>
+      <w:bookmarkEnd w:id="61"/>
+      <w:r>
+        <w:rPr>
+          <w:b w:val="1"/>
+          <w:bCs w:val="1"/>
+          <w:sz w:val="30"/>
+          <w:szCs w:val="30"/>
+          <w:rtl w:val="0"/>
+        </w:rPr>
+        <w:t xml:space="preserve">Failure Rates in Introductory Programming Revisited (C. Watson e F. W. B. Li, 2014)</w:t>
+      </w:r>
+      <w:r>
+        <w:rPr>
+          <w:rtl w:val="0"/>
+        </w:rPr>
+      </w:r>
+    </w:p>
+    <w:p>
+      <w:pPr>
+        <w:rPr>
+          <w:b w:val="1"/>
+          <w:bCs w:val="1"/>
+          <w:sz w:val="30"/>
+          <w:szCs w:val="30"/>
+        </w:rPr>
+      </w:pPr>
+      <w:r>
+        <w:pict>
+          <v:rect style="width:0.0pt;height:1.5pt" o:hr="t" o:hrstd="t" o:hralign="center" fillcolor="#A0A0A0" stroked="f"/>
+        </w:pict>
+      </w:r>
+      <w:r>
+        <w:rPr>
+          <w:rtl w:val="0"/>
+        </w:rPr>
+      </w:r>
+    </w:p>
+    <w:p>
+      <w:pPr>
+        <w:pStyle w:val="Heading2"/>
+        <w:keepNext w:val="0"/>
+        <w:keepLines w:val="0"/>
+        <w:spacing w:after="80" w:before="240" w:lineRule="auto"/>
+        <w:rPr>
+          <w:b w:val="1"/>
+          <w:bCs w:val="1"/>
+          <w:sz w:val="26"/>
+          <w:szCs w:val="26"/>
+        </w:rPr>
+      </w:pPr>
+      <w:bookmarkStart w:colFirst="0" w:colLast="0" w:name="_mv1hp8p55mcb" w:id="62"/>
+      <w:bookmarkEnd w:id="62"/>
+      <w:r>
+        <w:rPr>
+          <w:b w:val="1"/>
+          <w:bCs w:val="1"/>
+          <w:sz w:val="26"/>
+          <w:szCs w:val="26"/>
+          <w:rtl w:val="0"/>
+        </w:rPr>
+        <w:t xml:space="preserve">Contexto</w:t>
+      </w:r>
+    </w:p>
+    <w:p>
+      <w:pPr>
+        <w:spacing w:after="120" w:lineRule="auto"/>
+        <w:jc w:val="both"/>
+        <w:rPr/>
+      </w:pPr>
+      <w:r>
+        <w:rPr>
+          <w:rtl w:val="0"/>
+        </w:rPr>
+        <w:t xml:space="preserve">A demanda por programadores cresce globalmente e os governos passam a levar programação à educação básica. Nesse cenário, as expressões taxa de reprovação e curso de programação tornaram-se quase sinônimas na literatura: taxas altas de reprovação são citadas rotineiramente como motivação de pesquisas em educação em programação. Os autores descobriram, ao conduzir uma meta-análise sobre preditores de desempenho em programação, que a maior parte dessa evidência era anedótica, e que apenas o estudo de Bennedsen e Caspersen (2007) havia tentado quantificar uma taxa mundial.</w:t>
+      </w:r>
+    </w:p>
+    <w:p>
+      <w:pPr>
+        <w:rPr/>
+      </w:pPr>
+      <w:r>
+        <w:pict>
+          <v:rect style="width:0.0pt;height:1.5pt" o:hr="t" o:hrstd="t" o:hralign="center" fillcolor="#A0A0A0" stroked="f"/>
+        </w:pict>
+      </w:r>
+      <w:r>
+        <w:rPr>
+          <w:rtl w:val="0"/>
+        </w:rPr>
+      </w:r>
+    </w:p>
+    <w:p>
+      <w:pPr>
+        <w:pStyle w:val="Heading2"/>
+        <w:keepNext w:val="0"/>
+        <w:keepLines w:val="0"/>
+        <w:spacing w:after="80" w:before="240" w:lineRule="auto"/>
+        <w:rPr>
+          <w:b w:val="1"/>
+          <w:bCs w:val="1"/>
+          <w:sz w:val="26"/>
+          <w:szCs w:val="26"/>
+        </w:rPr>
+      </w:pPr>
+      <w:bookmarkStart w:colFirst="0" w:colLast="0" w:name="_r128e1xcv2k2" w:id="63"/>
+      <w:bookmarkEnd w:id="63"/>
+      <w:r>
+        <w:rPr>
+          <w:b w:val="1"/>
+          <w:bCs w:val="1"/>
+          <w:sz w:val="26"/>
+          <w:szCs w:val="26"/>
+          <w:rtl w:val="0"/>
+        </w:rPr>
+        <w:t xml:space="preserve">Problema</w:t>
+      </w:r>
+    </w:p>
+    <w:p>
+      <w:pPr>
+        <w:spacing w:after="120" w:lineRule="auto"/>
+        <w:jc w:val="both"/>
+        <w:rPr/>
+      </w:pPr>
+      <w:r>
+        <w:rPr>
+          <w:rtl w:val="0"/>
+        </w:rPr>
+        <w:t xml:space="preserve">O estudo de 2007 tinha quatro limitações que este trabalho busca endereçar: era um retrato de um único ponto no tempo, impedindo análise de tendência; a amostra de 63 cursos era reconhecidamente insuficiente para generalização; 66% das respostas vinham dos Estados Unidos; e o levantamento alcançou apenas autores de cinco conferências, deixando inexplorada a evidência publicada em outros veículos. As questões de pesquisa foram: quais são as taxas de aprovação e reprovação de CS1 e se são altas; como essas taxas se comportam ao longo do tempo; e se são moderadas por país, linguagem de programação ensinada, tamanho da turma e nível institucional.</w:t>
+      </w:r>
+    </w:p>
+    <w:p>
+      <w:pPr>
+        <w:rPr/>
+      </w:pPr>
+      <w:r>
+        <w:pict>
+          <v:rect style="width:0.0pt;height:1.5pt" o:hr="t" o:hrstd="t" o:hralign="center" fillcolor="#A0A0A0" stroked="f"/>
+        </w:pict>
+      </w:r>
+      <w:r>
+        <w:rPr>
+          <w:rtl w:val="0"/>
+        </w:rPr>
+      </w:r>
+    </w:p>
+    <w:p>
+      <w:pPr>
+        <w:pStyle w:val="Heading2"/>
+        <w:keepNext w:val="0"/>
+        <w:keepLines w:val="0"/>
+        <w:spacing w:after="80" w:before="240" w:lineRule="auto"/>
+        <w:rPr>
+          <w:b w:val="1"/>
+          <w:bCs w:val="1"/>
+          <w:sz w:val="26"/>
+          <w:szCs w:val="26"/>
+        </w:rPr>
+      </w:pPr>
+      <w:bookmarkStart w:colFirst="0" w:colLast="0" w:name="_hy4hh25303mq" w:id="64"/>
+      <w:bookmarkEnd w:id="64"/>
+      <w:r>
+        <w:rPr>
+          <w:b w:val="1"/>
+          <w:bCs w:val="1"/>
+          <w:sz w:val="26"/>
+          <w:szCs w:val="26"/>
+          <w:rtl w:val="0"/>
+        </w:rPr>
+        <w:t xml:space="preserve">Solução / Método</w:t>
+      </w:r>
+    </w:p>
+    <w:p>
+      <w:pPr>
+        <w:spacing w:after="120" w:lineRule="auto"/>
+        <w:jc w:val="both"/>
+        <w:rPr/>
+      </w:pPr>
+      <w:r>
+        <w:rPr>
+          <w:rtl w:val="0"/>
+        </w:rPr>
+        <w:t xml:space="preserve">Em vez de survey, revisão sistemática da literatura de CS1 (1960 a junho de 2013) com análise estatística dos dados extraídos. A busca inicial, herdada da meta-análise sobre preditores, varreu doze bases (ACM, IEEE, Science Direct, Wiley, Taylor &amp; Francis, JSTOR, SAGE, PsycNET, EThOS, ProQuest, DART, Trove) mais Google Scholar, ISI e ERIC, com estratégia booleana definida por dois pesquisadores: de 1378 artigos identificados, 58 examinavam preditores e 12 traziam dados de reprovação. Uma busca secundária com termos de taxa de aprovação, reprovação e evasão acrescentou 42 artigos. Após verificação de duplicidade de dados, a amostra final reuniu 54 trabalhos (37 de conferência, 11 de periódico, 3 teses, 2 não publicados e 1 capítulo de livro), descrevendo 161 cursos de CS1 ministrados entre 1979 e 2013 (80% a partir de 2003), em 51 instituições de 15 países. As análises usaram ANOVA e Welch ANOVA com verificação de pressupostos.</w:t>
+      </w:r>
+    </w:p>
+    <w:p>
+      <w:pPr>
+        <w:rPr/>
+      </w:pPr>
+      <w:r>
+        <w:pict>
+          <v:rect style="width:0.0pt;height:1.5pt" o:hr="t" o:hrstd="t" o:hralign="center" fillcolor="#A0A0A0" stroked="f"/>
+        </w:pict>
+      </w:r>
+      <w:r>
+        <w:rPr>
+          <w:rtl w:val="0"/>
+        </w:rPr>
+      </w:r>
+    </w:p>
+    <w:p>
+      <w:pPr>
+        <w:pStyle w:val="Heading2"/>
+        <w:keepNext w:val="0"/>
+        <w:keepLines w:val="0"/>
+        <w:spacing w:after="80" w:before="240" w:lineRule="auto"/>
+        <w:rPr>
+          <w:b w:val="1"/>
+          <w:bCs w:val="1"/>
+          <w:sz w:val="26"/>
+          <w:szCs w:val="26"/>
+        </w:rPr>
+      </w:pPr>
+      <w:bookmarkStart w:colFirst="0" w:colLast="0" w:name="_mq6sm9sjldww" w:id="65"/>
+      <w:bookmarkEnd w:id="65"/>
+      <w:r>
+        <w:rPr>
+          <w:b w:val="1"/>
+          <w:bCs w:val="1"/>
+          <w:sz w:val="26"/>
+          <w:szCs w:val="26"/>
+          <w:rtl w:val="0"/>
+        </w:rPr>
+        <w:t xml:space="preserve">Avaliação</w:t>
+      </w:r>
+    </w:p>
+    <w:p>
+      <w:pPr>
+        <w:spacing w:after="120" w:lineRule="auto"/>
+        <w:jc w:val="both"/>
+        <w:rPr/>
+      </w:pPr>
+      <w:r>
+        <w:rPr>
+          <w:rtl w:val="0"/>
+        </w:rPr>
+        <w:t xml:space="preserve">O desenho responde diretamente às limitações do estudo anterior: a amostra é 2,6 vezes maior e menos dominada por um único país (37% dos resultados dos EUA, seguidos de Austrália com 17%, Finlândia com 15% e Reino Unido com 10%). Os autores reconhecem três ameaças à validade: 161 cursos de 15 países ainda são pouco para escala mundial; pode haver viés de publicação, pois instituições relutam em publicar taxas ruins, o que implicaria taxa real de aprovação menor que a encontrada; e as definições de aprovação variam entre estudos (nota mínima de 40%, conceito C, qualquer nota exceto F), obrigando a assumir uma noção consistente que pode não existir. Nota externa relevante: Guzdial criticou publicamente o estudo por possível dupla contagem de dados e por não citar explicitamente os artigos usados na análise, crítica registrada por Bennedsen e Caspersen (2019).</w:t>
+      </w:r>
+    </w:p>
+    <w:p>
+      <w:pPr>
+        <w:rPr/>
+      </w:pPr>
+      <w:r>
+        <w:pict>
+          <v:rect style="width:0.0pt;height:1.5pt" o:hr="t" o:hrstd="t" o:hralign="center" fillcolor="#A0A0A0" stroked="f"/>
+        </w:pict>
+      </w:r>
+      <w:r>
+        <w:rPr>
+          <w:rtl w:val="0"/>
+        </w:rPr>
+      </w:r>
+    </w:p>
+    <w:p>
+      <w:pPr>
+        <w:pStyle w:val="Heading2"/>
+        <w:keepNext w:val="0"/>
+        <w:keepLines w:val="0"/>
+        <w:spacing w:after="80" w:before="240" w:lineRule="auto"/>
+        <w:rPr>
+          <w:b w:val="1"/>
+          <w:bCs w:val="1"/>
+          <w:sz w:val="26"/>
+          <w:szCs w:val="26"/>
+        </w:rPr>
+      </w:pPr>
+      <w:bookmarkStart w:colFirst="0" w:colLast="0" w:name="_7frd4tye767q" w:id="66"/>
+      <w:bookmarkEnd w:id="66"/>
+      <w:r>
+        <w:rPr>
+          <w:b w:val="1"/>
+          <w:bCs w:val="1"/>
+          <w:sz w:val="26"/>
+          <w:szCs w:val="26"/>
+          <w:rtl w:val="0"/>
+        </w:rPr>
+        <w:t xml:space="preserve">Resultados</w:t>
+      </w:r>
+    </w:p>
+    <w:p>
+      <w:pPr>
+        <w:spacing w:after="120" w:lineRule="auto"/>
+        <w:jc w:val="both"/>
+        <w:rPr/>
+      </w:pPr>
+      <w:r>
+        <w:rPr>
+          <w:rtl w:val="0"/>
+        </w:rPr>
+        <w:t xml:space="preserve">A taxa média mundial de aprovação encontrada foi de 67,7% (IC 95%: 65,3% a 70,1%), praticamente idêntica aos 67% de Bennedsen e Caspersen, com reprovação ampla de 32,3%. As taxas variaram de 23,1% a 96%. Não houve diferença estatisticamente significativa ao longo do tempo (F(21,139) = 0,486; p = 0,971), resultado notável dado o aumento de ferramentas de apoio ao ensino no período. Houve diferenças significativas por país (p &lt; 0,001), com Portugal (37,9%), Alemanha (44,7%) e Brasil (45%) apresentando as menores taxas médias de aprovação da amostra, ressalvadas as amostras pequenas desses países; entre os quatro países dominantes, apenas variações não significativas. Não houve efeito da linguagem ensinada (incluindo Python; Welch F = 1,26; p = 0,31). Turmas pequenas aprovaram mais (80,1% contra 65,4%) e universidades aprovaram menos que outros níveis institucionais (66,4% contra 79,9%). Os autores concluem que a taxa não é alarmantemente baixa, mas que há espaço considerável de melhoria: um ganho de 5% na aprovação representaria cerca de cem mil alunos a mais formados por ano.</w:t>
+      </w:r>
+    </w:p>
+    <w:p>
+      <w:pPr>
+        <w:rPr/>
+      </w:pPr>
+      <w:r>
+        <w:pict>
+          <v:rect style="width:0.0pt;height:1.5pt" o:hr="t" o:hrstd="t" o:hralign="center" fillcolor="#A0A0A0" stroked="f"/>
+        </w:pict>
+      </w:r>
+      <w:r>
+        <w:rPr>
+          <w:rtl w:val="0"/>
+        </w:rPr>
+      </w:r>
+    </w:p>
+    <w:p>
+      <w:pPr>
+        <w:pStyle w:val="Heading2"/>
+        <w:keepNext w:val="0"/>
+        <w:keepLines w:val="0"/>
+        <w:spacing w:after="80" w:before="240" w:lineRule="auto"/>
+        <w:rPr>
+          <w:b w:val="1"/>
+          <w:bCs w:val="1"/>
+          <w:sz w:val="26"/>
+          <w:szCs w:val="26"/>
+        </w:rPr>
+      </w:pPr>
+      <w:bookmarkStart w:colFirst="0" w:colLast="0" w:name="_caljy6i11k3u" w:id="67"/>
+      <w:bookmarkEnd w:id="67"/>
+      <w:r>
+        <w:rPr>
+          <w:b w:val="1"/>
+          <w:bCs w:val="1"/>
+          <w:sz w:val="26"/>
+          <w:szCs w:val="26"/>
+          <w:rtl w:val="0"/>
+        </w:rPr>
+        <w:t xml:space="preserve">Como se aplica ao meu trabalho?</w:t>
+      </w:r>
+    </w:p>
+    <w:p>
+      <w:pPr>
+        <w:spacing w:after="120" w:lineRule="auto"/>
+        <w:jc w:val="both"/>
+        <w:rPr/>
+      </w:pPr>
+      <w:r>
+        <w:rPr>
+          <w:rtl w:val="0"/>
+        </w:rPr>
+        <w:t xml:space="preserve">É a fonte verificada do número de um terço citado na introdução (32,3%), com o selo de melhor artigo do ITiCSE 2014 e CPY alto. Quatro conexões diretas. Primeiro, a estabilidade temporal das taxas, sem melhora significativa em mais de três décadas apesar da proliferação de ferramentas, fortalece a motivação para novos formatos de recurso didático, como o objeto de aprendizagem deste TCC. Segundo, o achado de que a linguagem ensinada não modera as taxas (incluindo Python) apoia empiricamente o enquadramento da minha introdução: a dificuldade não está na sintaxe de uma linguagem específica, mas em algo transversal, coerente com o salto entre compreender conceitos isolados e integrá-los num programa completo. Terceiro, o dado do Brasil entre as menores taxas de aprovação da amostra, ainda que sob ressalva de amostra pequena, dá relevância local à motivação e pode ser mencionado com o devido cuidado. Quarto, a implicação dos autores de que o melhor caminho para CS1 pode envolver grupos pequenos e instrução ativa em sala conversa com o cenário de uso previsto para o meu objeto: aplicação mediada por professor como prática de consolidação.</w:t>
+      </w:r>
+    </w:p>
+    <w:p>
+      <w:pPr>
+        <w:rPr/>
+      </w:pPr>
+      <w:r>
+        <w:pict>
+          <v:rect style="width:0.0pt;height:1.5pt" o:hr="t" o:hrstd="t" o:hralign="center" fillcolor="#A0A0A0" stroked="f"/>
+        </w:pict>
+      </w:r>
+      <w:r>
+        <w:rPr>
+          <w:rtl w:val="0"/>
+        </w:rPr>
+      </w:r>
+    </w:p>
+    <w:p>
+      <w:pPr>
+        <w:rPr/>
+      </w:pPr>
+      <w:r>
+        <w:rPr>
+          <w:rtl w:val="0"/>
+        </w:rPr>
+      </w:r>
+    </w:p>
+    <w:p>
+      <w:pPr>
+        <w:rPr/>
+      </w:pPr>
+      <w:r>
+        <w:rPr>
+          <w:rtl w:val="0"/>
+        </w:rPr>
+      </w:r>
+    </w:p>
+    <w:p>
+      <w:pPr>
+        <w:pStyle w:val="Heading1"/>
+        <w:keepNext w:val="0"/>
+        <w:keepLines w:val="0"/>
+        <w:spacing w:before="360" w:lineRule="auto"/>
+        <w:rPr>
+          <w:sz w:val="22"/>
+          <w:szCs w:val="22"/>
+        </w:rPr>
+      </w:pPr>
+      <w:bookmarkStart w:colFirst="0" w:colLast="0" w:name="_4n9p1s8x2khj" w:id="68"/>
+      <w:bookmarkEnd w:id="68"/>
+      <w:r>
+        <w:rPr>
+          <w:b w:val="1"/>
+          <w:bCs w:val="1"/>
+          <w:sz w:val="26"/>
+          <w:szCs w:val="26"/>
+          <w:rtl w:val="0"/>
+        </w:rPr>
+        <w:t xml:space="preserve">Failure Rates in Introductory Programming — 12 Years Later (J. Bennedsen e M. E. Caspersen, 2019)</w:t>
+      </w:r>
+      <w:r>
+        <w:rPr>
+          <w:rtl w:val="0"/>
+        </w:rPr>
+      </w:r>
+    </w:p>
+    <w:p>
+      <w:pPr>
+        <w:rPr>
+          <w:b w:val="1"/>
+          <w:bCs w:val="1"/>
+          <w:sz w:val="26"/>
+          <w:szCs w:val="26"/>
+        </w:rPr>
+      </w:pPr>
+      <w:r>
+        <w:pict>
+          <v:rect style="width:0.0pt;height:1.5pt" o:hr="t" o:hrstd="t" o:hralign="center" fillcolor="#A0A0A0" stroked="f"/>
+        </w:pict>
+      </w:r>
+      <w:r>
+        <w:rPr>
+          <w:rtl w:val="0"/>
+        </w:rPr>
+      </w:r>
+    </w:p>
+    <w:p>
+      <w:pPr>
+        <w:pStyle w:val="Heading2"/>
+        <w:keepNext w:val="0"/>
+        <w:keepLines w:val="0"/>
+        <w:spacing w:after="80" w:before="240" w:lineRule="auto"/>
+        <w:rPr>
+          <w:b w:val="1"/>
+          <w:bCs w:val="1"/>
+          <w:sz w:val="26"/>
+          <w:szCs w:val="26"/>
+        </w:rPr>
+      </w:pPr>
+      <w:bookmarkStart w:colFirst="0" w:colLast="0" w:name="_w3n808eb0dht" w:id="69"/>
+      <w:bookmarkEnd w:id="69"/>
+      <w:r>
+        <w:rPr>
+          <w:b w:val="1"/>
+          <w:bCs w:val="1"/>
+          <w:sz w:val="26"/>
+          <w:szCs w:val="26"/>
+          <w:rtl w:val="0"/>
+        </w:rPr>
+        <w:t xml:space="preserve">Contexto</w:t>
+      </w:r>
+    </w:p>
+    <w:p>
+      <w:pPr>
+        <w:spacing w:after="120" w:lineRule="auto"/>
+        <w:jc w:val="both"/>
+        <w:rPr/>
+      </w:pPr>
+      <w:r>
+        <w:rPr>
+          <w:rtl w:val="0"/>
+        </w:rPr>
+        <w:t xml:space="preserve">O estudo de 2007 seguia intensamente citado mais de dez anos depois, com mais da metade das citações concentradas nos três anos anteriores, sinal de que o tema permanecia vivo: a maioria dos citantes usa o artigo para sustentar que CS1 tem um problema e então propor alguma intervenção. No intervalo, apenas um estudo comparável havia sido publicado (Watson e Li, 2014), sobre o qual Guzdial apontou limitações: ninguém publica artigo admitindo retenção ruim por dez anos seguidos, os mesmos dados de turmas apareceram em mais de um artigo incluído, e os autores não citaram explicitamente os trabalhos usados na análise. A percepção de que aprender a programar é difícil permanecia disseminada.</w:t>
+      </w:r>
+    </w:p>
+    <w:p>
+      <w:pPr>
+        <w:rPr/>
+      </w:pPr>
+      <w:r>
+        <w:pict>
+          <v:rect style="width:0.0pt;height:1.5pt" o:hr="t" o:hrstd="t" o:hralign="center" fillcolor="#A0A0A0" stroked="f"/>
+        </w:pict>
+      </w:r>
+      <w:r>
+        <w:rPr>
+          <w:rtl w:val="0"/>
+        </w:rPr>
+      </w:r>
+    </w:p>
+    <w:p>
+      <w:pPr>
+        <w:pStyle w:val="Heading2"/>
+        <w:keepNext w:val="0"/>
+        <w:keepLines w:val="0"/>
+        <w:spacing w:after="80" w:before="240" w:lineRule="auto"/>
+        <w:rPr>
+          <w:b w:val="1"/>
+          <w:bCs w:val="1"/>
+          <w:sz w:val="26"/>
+          <w:szCs w:val="26"/>
+        </w:rPr>
+      </w:pPr>
+      <w:bookmarkStart w:colFirst="0" w:colLast="0" w:name="_6lg4m3du2g50" w:id="70"/>
+      <w:bookmarkEnd w:id="70"/>
+      <w:r>
+        <w:rPr>
+          <w:b w:val="1"/>
+          <w:bCs w:val="1"/>
+          <w:sz w:val="26"/>
+          <w:szCs w:val="26"/>
+          <w:rtl w:val="0"/>
+        </w:rPr>
+        <w:t xml:space="preserve">Problema</w:t>
+      </w:r>
+    </w:p>
+    <w:p>
+      <w:pPr>
+        <w:spacing w:after="120" w:lineRule="auto"/>
+        <w:jc w:val="both"/>
+        <w:rPr/>
+      </w:pPr>
+      <w:r>
+        <w:rPr>
+          <w:rtl w:val="0"/>
+        </w:rPr>
+        <w:t xml:space="preserve">Continuava não existindo estatística mundial confiável sobre taxas de reprovação, evasão e aprovação em CS1. Diante disso, os autores consideraram pertinente refazer as mesmas perguntas de doze anos antes para verificar o estado atual e eventuais mudanças: quais são as taxas de reprovação e aprovação de cursos introdutórios de programação no nível universitário, e se a taxa de reprovação é alta.</w:t>
+      </w:r>
+    </w:p>
+    <w:p>
+      <w:pPr>
+        <w:rPr/>
+      </w:pPr>
+      <w:r>
+        <w:pict>
+          <v:rect style="width:0.0pt;height:1.5pt" o:hr="t" o:hrstd="t" o:hralign="center" fillcolor="#A0A0A0" stroked="f"/>
+        </w:pict>
+      </w:r>
+      <w:r>
+        <w:rPr>
+          <w:rtl w:val="0"/>
+        </w:rPr>
+      </w:r>
+    </w:p>
+    <w:p>
+      <w:pPr>
+        <w:pStyle w:val="Heading2"/>
+        <w:keepNext w:val="0"/>
+        <w:keepLines w:val="0"/>
+        <w:spacing w:after="80" w:before="240" w:lineRule="auto"/>
+        <w:rPr>
+          <w:b w:val="1"/>
+          <w:bCs w:val="1"/>
+          <w:sz w:val="26"/>
+          <w:szCs w:val="26"/>
+        </w:rPr>
+      </w:pPr>
+      <w:bookmarkStart w:colFirst="0" w:colLast="0" w:name="_i6u40n7owr5p" w:id="71"/>
+      <w:bookmarkEnd w:id="71"/>
+      <w:r>
+        <w:rPr>
+          <w:b w:val="1"/>
+          <w:bCs w:val="1"/>
+          <w:sz w:val="26"/>
+          <w:szCs w:val="26"/>
+          <w:rtl w:val="0"/>
+        </w:rPr>
+        <w:t xml:space="preserve">Solução / Método</w:t>
+      </w:r>
+    </w:p>
+    <w:p>
+      <w:pPr>
+        <w:spacing w:after="120" w:lineRule="auto"/>
+        <w:jc w:val="both"/>
+        <w:rPr/>
+      </w:pPr>
+      <w:r>
+        <w:rPr>
+          <w:rtl w:val="0"/>
+        </w:rPr>
+        <w:t xml:space="preserve">Replicação deliberada do estudo de 2006/07, mantendo o mesmo questionário (abort, skip, fail, pass, tipo de instituição e forma de avaliação) e os mesmos canais de coleta, agora com os autores das edições de 2017 das cinco conferências (Koli Calling, SIGCSE, ITiCSE, ICALT e ACE). Dos 1068 autores identificados, chegou-se a 998 contatados e a uma população de 957 após mensagens não entregues. Responderam integralmente 170 pessoas (17,8%, contra 12,7% em 2006/07), das quais 161 de ensino superior foram analisadas (respostas de colleges e universidades). Os autores cogitaram melhorar o questionário, mas mantiveram o desenho original para maximizar a comparabilidade, adiando mudanças para um futuro estudo qualitativo sobre as causas da reprovação.</w:t>
+      </w:r>
+    </w:p>
+    <w:p>
+      <w:pPr>
+        <w:rPr/>
+      </w:pPr>
+      <w:r>
+        <w:pict>
+          <v:rect style="width:0.0pt;height:1.5pt" o:hr="t" o:hrstd="t" o:hralign="center" fillcolor="#A0A0A0" stroked="f"/>
+        </w:pict>
+      </w:r>
+      <w:r>
+        <w:rPr>
+          <w:rtl w:val="0"/>
+        </w:rPr>
+      </w:r>
+    </w:p>
+    <w:p>
+      <w:pPr>
+        <w:pStyle w:val="Heading2"/>
+        <w:keepNext w:val="0"/>
+        <w:keepLines w:val="0"/>
+        <w:spacing w:after="80" w:before="240" w:lineRule="auto"/>
+        <w:rPr>
+          <w:b w:val="1"/>
+          <w:bCs w:val="1"/>
+          <w:sz w:val="26"/>
+          <w:szCs w:val="26"/>
+        </w:rPr>
+      </w:pPr>
+      <w:bookmarkStart w:colFirst="0" w:colLast="0" w:name="_72oeqfqco2bi" w:id="72"/>
+      <w:bookmarkEnd w:id="72"/>
+      <w:r>
+        <w:rPr>
+          <w:b w:val="1"/>
+          <w:bCs w:val="1"/>
+          <w:sz w:val="26"/>
+          <w:szCs w:val="26"/>
+          <w:rtl w:val="0"/>
+        </w:rPr>
+        <w:t xml:space="preserve">Avaliação</w:t>
+      </w:r>
+    </w:p>
+    <w:p>
+      <w:pPr>
+        <w:spacing w:after="120" w:lineRule="auto"/>
+        <w:jc w:val="both"/>
+        <w:rPr/>
+      </w:pPr>
+      <w:r>
+        <w:rPr>
+          <w:rtl w:val="0"/>
+        </w:rPr>
+        <w:t xml:space="preserve">Como replicação, o estudo herda e declara as limitações do original: respondentes autosselecionados de comunidades engajadas em educação em computação, dúvidas sobre se cada resposta representa a instituição inteira ou apenas o curso do respondente, e interpretações possivelmente divergentes dos termos do questionário (dois respondentes sequer tinham exame final). O número absoluto de respondentes quase triplicou (de 63 para 170) e a distribuição geográfica melhorou em relação a 2006/07, quando a América do Norte era mais sobrerrepresentada, mas 161 universidades ainda é pouco em escala mundial. O quadro de referência externo usado para julgar se a taxa é alta, a álgebra universitária nos EUA com reprovação de 42% a 50%, é útil, embora os próprios autores registrem a observação de um revisor de que o que conta como alto varia por tipo de instituição.</w:t>
+      </w:r>
+    </w:p>
+    <w:p>
+      <w:pPr>
+        <w:rPr/>
+      </w:pPr>
+      <w:r>
+        <w:pict>
+          <v:rect style="width:0.0pt;height:1.5pt" o:hr="t" o:hrstd="t" o:hralign="center" fillcolor="#A0A0A0" stroked="f"/>
+        </w:pict>
+      </w:r>
+      <w:r>
+        <w:rPr>
+          <w:rtl w:val="0"/>
+        </w:rPr>
+      </w:r>
+    </w:p>
+    <w:p>
+      <w:pPr>
+        <w:pStyle w:val="Heading2"/>
+        <w:keepNext w:val="0"/>
+        <w:keepLines w:val="0"/>
+        <w:spacing w:after="80" w:before="240" w:lineRule="auto"/>
+        <w:rPr>
+          <w:b w:val="1"/>
+          <w:bCs w:val="1"/>
+          <w:sz w:val="26"/>
+          <w:szCs w:val="26"/>
+        </w:rPr>
+      </w:pPr>
+      <w:bookmarkStart w:colFirst="0" w:colLast="0" w:name="_9zmhp563s2" w:id="73"/>
+      <w:bookmarkEnd w:id="73"/>
+      <w:r>
+        <w:rPr>
+          <w:b w:val="1"/>
+          <w:bCs w:val="1"/>
+          <w:sz w:val="26"/>
+          <w:szCs w:val="26"/>
+          <w:rtl w:val="0"/>
+        </w:rPr>
+        <w:t xml:space="preserve">Resultados</w:t>
+      </w:r>
+    </w:p>
+    <w:p>
+      <w:pPr>
+        <w:spacing w:after="120" w:lineRule="auto"/>
+        <w:jc w:val="both"/>
+        <w:rPr/>
+      </w:pPr>
+      <w:r>
+        <w:rPr>
+          <w:rtl w:val="0"/>
+        </w:rPr>
+        <w:t xml:space="preserve">A taxa agregada de aprovação foi de 72%, contra 67% em 2006/07, aumento de cinco pontos percentuais estatisticamente significativo. A reprovação média caiu de 33% para 28%. As taxas de 2018 foram: abort 11,1%, skip 4,4%, fail 12,8%. A variação segue enorme, de 9% a 100% de aprovação, e o tamanho médio dos cursos subiu de 116 para 196 alunos. Colleges aprovaram significativamente mais que universidades (83% contra 71%; p = 0,001). Comparando com a reprovação de 42% a 50% da álgebra universitária americana, os autores concluem que a reprovação de 28% em CS1 não é alarmantemente alta, mantendo a conclusão principal de 2007. Ao mesmo tempo, fecham com uma ressalva importante: introduzir estudantes à computação segue sendo um dos grandes desafios da área, e, numa era em que a educação em computação se torna educação geral e os alunos não escolhem programar por interesse pessoal, o desafio não apenas persiste como se intensifica.</w:t>
+      </w:r>
+    </w:p>
+    <w:p>
+      <w:pPr>
+        <w:rPr/>
+      </w:pPr>
+      <w:r>
+        <w:pict>
+          <v:rect style="width:0.0pt;height:1.5pt" o:hr="t" o:hrstd="t" o:hralign="center" fillcolor="#A0A0A0" stroked="f"/>
+        </w:pict>
+      </w:r>
+      <w:r>
+        <w:rPr>
+          <w:rtl w:val="0"/>
+        </w:rPr>
+      </w:r>
+    </w:p>
+    <w:p>
+      <w:pPr>
+        <w:pStyle w:val="Heading2"/>
+        <w:keepNext w:val="0"/>
+        <w:keepLines w:val="0"/>
+        <w:spacing w:after="80" w:before="240" w:lineRule="auto"/>
+        <w:rPr>
+          <w:b w:val="1"/>
+          <w:bCs w:val="1"/>
+          <w:sz w:val="26"/>
+          <w:szCs w:val="26"/>
+        </w:rPr>
+      </w:pPr>
+      <w:bookmarkStart w:colFirst="0" w:colLast="0" w:name="_j1cm80wpmap6" w:id="74"/>
+      <w:bookmarkEnd w:id="74"/>
+      <w:r>
+        <w:rPr>
+          <w:b w:val="1"/>
+          <w:bCs w:val="1"/>
+          <w:sz w:val="26"/>
+          <w:szCs w:val="26"/>
+          <w:rtl w:val="0"/>
+        </w:rPr>
+        <w:t xml:space="preserve">Como se aplica ao meu trabalho?</w:t>
+      </w:r>
+    </w:p>
+    <w:p>
+      <w:pPr>
+        <w:spacing w:after="120" w:lineRule="auto"/>
+        <w:jc w:val="both"/>
+        <w:rPr/>
+      </w:pPr>
+      <w:r>
+        <w:rPr>
+          <w:rtl w:val="0"/>
+        </w:rPr>
+        <w:t xml:space="preserve">Este artigo atualiza e calibra a afirmação de abertura da minha introdução. A formulação que adotei, taxas expressivas com estimativas em torno de um terço e melhora gradual recente para aprovação na casa de 72%, é exatamente o que os três estudos em conjunto sustentam, nem mais nem menos. Três usos adicionais. Primeiro, o argumento de que mesmo o cenário melhorado deixa mais de um quarto dos alunos sem aprovação mantém de pé a relevância de recursos de consolidação. Segundo, a observação final sobre a era do CS for All, com alunos que não escolhem programar por interesse pessoal, reforça o papel motivacional de recursos baseados em jogos, que é justamente o apelo central do meu objeto. Terceiro, o registro da crítica de Guzdial a Watson e Li me dá o contexto necessário para citar os dois números (32,3% e 28%) com a hierarquia certa de confiança, apresentando-os como estimativas convergentes de métodos diferentes e limitados, não como censos. Vale ainda a nota terminológica: os quatro termos do questionário (abort, skip, fail, pass) mostram que reprovação ampla inclui abandono e ausência ao exame, distinção que devo preservar se detalhar os números no texto.</w:t>
+      </w:r>
+    </w:p>
+    <w:p>
+      <w:pPr>
+        <w:rPr/>
+      </w:pPr>
+      <w:r>
+        <w:pict>
+          <v:rect style="width:0.0pt;height:1.5pt" o:hr="t" o:hrstd="t" o:hralign="center" fillcolor="#A0A0A0" stroked="f"/>
+        </w:pict>
+      </w:r>
       <w:r>
         <w:rPr>
           <w:rtl w:val="0"/>

</xml_diff>